<commit_message>
docs: refresh presentation with investigation tools (networks, red-flags, wealth anomalies)
- 15 -> 18 pages; add Retele, Red-flags, Anomalii avere to dashboard list
- New 'Instrumente de investigatie' section: control rings, OCDS red-flags (58.7k single-bid / 29.5k fragmentation), PyOD wealth anomalies
- Regenerated DOCX + PDF (4 pages)

Co-Authored-By: Claude Opus 4.8 (1M context) <noreply@anthropic.com>
</commit_message>
<xml_diff>
--- a/docs/PREZENTARE_SOLOMONAR.docx
+++ b/docs/PREZENTARE_SOLOMONAR.docx
@@ -963,7 +963,7 @@
           <w:color w:val="6D28D9"/>
           <w:sz w:val="25"/>
         </w:rPr>
-        <w:t>Dashboard-ul complet „SOLOMONAR Insights” (15 pagini)</w:t>
+        <w:t>Dashboard-ul complet „SOLOMONAR Insights” (18 pagini)</w:t>
       </w:r>
     </w:p>
     <w:p>
@@ -987,7 +987,67 @@
           <w:color w:val="1C1E26"/>
           <w:sz w:val="20"/>
         </w:rPr>
-        <w:t xml:space="preserve"> cu cele 15 pagini: Persoane · Companii · Achiziții · Achiziții directe · Follow-the-money · Partide · Bugete · DNA · Comisii · Hartă · Analytics · Alerte · Sancțiuni · Firme-paravan (+ Overview). Rulează </w:t>
+        <w:t xml:space="preserve"> cu </w:t>
+      </w:r>
+      <w:r>
+        <w:rPr>
+          <w:b/>
+          <w:color w:val="1C1E26"/>
+          <w:sz w:val="20"/>
+        </w:rPr>
+        <w:t>18 pagini</w:t>
+      </w:r>
+      <w:r>
+        <w:rPr>
+          <w:color w:val="1C1E26"/>
+          <w:sz w:val="20"/>
+        </w:rPr>
+        <w:t xml:space="preserve">: Persoane · Companii · Achiziții · Achiziții directe · Follow-the-money · Partide · Bugete · DNA · Comisii · Hartă (choropleth) · Analytics · Alerte · Sancțiuni · Firme-paravan · </w:t>
+      </w:r>
+      <w:r>
+        <w:rPr>
+          <w:b/>
+          <w:color w:val="1C1E26"/>
+          <w:sz w:val="20"/>
+        </w:rPr>
+        <w:t>Rețele</w:t>
+      </w:r>
+      <w:r>
+        <w:rPr>
+          <w:color w:val="1C1E26"/>
+          <w:sz w:val="20"/>
+        </w:rPr>
+        <w:t xml:space="preserve"> · </w:t>
+      </w:r>
+      <w:r>
+        <w:rPr>
+          <w:b/>
+          <w:color w:val="1C1E26"/>
+          <w:sz w:val="20"/>
+        </w:rPr>
+        <w:t>Red-flags</w:t>
+      </w:r>
+      <w:r>
+        <w:rPr>
+          <w:color w:val="1C1E26"/>
+          <w:sz w:val="20"/>
+        </w:rPr>
+        <w:t xml:space="preserve"> · </w:t>
+      </w:r>
+      <w:r>
+        <w:rPr>
+          <w:b/>
+          <w:color w:val="1C1E26"/>
+          <w:sz w:val="20"/>
+        </w:rPr>
+        <w:t>Anomalii avere</w:t>
+      </w:r>
+      <w:r>
+        <w:rPr>
+          <w:color w:val="1C1E26"/>
+          <w:sz w:val="20"/>
+        </w:rPr>
+        <w:t xml:space="preserve"> (+ Overview). Rulează </w:t>
       </w:r>
       <w:r>
         <w:rPr>
@@ -1523,6 +1583,124 @@
           <w:color w:val="6D28D9"/>
           <w:sz w:val="25"/>
         </w:rPr>
+        <w:t>Instrumente de investigație (analiză avansată)</w:t>
+      </w:r>
+    </w:p>
+    <w:p>
+      <w:pPr>
+        <w:pStyle w:val="ListBullet"/>
+        <w:spacing w:after="40"/>
+      </w:pPr>
+      <w:r>
+        <w:rPr>
+          <w:b/>
+          <w:sz w:val="20"/>
+        </w:rPr>
+        <w:t xml:space="preserve">🕸️ Rețele &amp; inele de control — </w:t>
+      </w:r>
+      <w:r>
+        <w:rPr>
+          <w:color w:val="1C1E26"/>
+          <w:sz w:val="20"/>
+        </w:rPr>
+        <w:t>graf de administratori comuni (ONRC): detectează automat grupuri de firme controlate de aceiași oameni — identifică corect grupuri reale (Erbașu, UMB/Tehnostrade, distribuitori farma) — plus administratori-hub și firme-pod, cu graf interactiv.</w:t>
+      </w:r>
+    </w:p>
+    <w:p>
+      <w:pPr>
+        <w:pStyle w:val="ListBullet"/>
+        <w:spacing w:after="40"/>
+      </w:pPr>
+      <w:r>
+        <w:rPr>
+          <w:b/>
+          <w:sz w:val="20"/>
+        </w:rPr>
+        <w:t xml:space="preserve">🚩 Red-flags achiziții (metodologie OCDS) — </w:t>
+      </w:r>
+      <w:r>
+        <w:rPr>
+          <w:color w:val="1C1E26"/>
+          <w:sz w:val="20"/>
+        </w:rPr>
+        <w:t xml:space="preserve">din datele per-linie SICAP: </w:t>
+      </w:r>
+      <w:r>
+        <w:rPr>
+          <w:b/>
+          <w:color w:val="1C1E26"/>
+          <w:sz w:val="20"/>
+        </w:rPr>
+        <w:t>58.717 contracte single-bid</w:t>
+      </w:r>
+      <w:r>
+        <w:rPr>
+          <w:color w:val="1C1E26"/>
+          <w:sz w:val="20"/>
+        </w:rPr>
+        <w:t xml:space="preserve"> (o singură ofertă) și </w:t>
+      </w:r>
+      <w:r>
+        <w:rPr>
+          <w:b/>
+          <w:color w:val="1C1E26"/>
+          <w:sz w:val="20"/>
+        </w:rPr>
+        <w:t>29.518 perechi de fragmentare</w:t>
+      </w:r>
+      <w:r>
+        <w:rPr>
+          <w:color w:val="1C1E26"/>
+          <w:sz w:val="20"/>
+        </w:rPr>
+        <w:t xml:space="preserve"> (atribuiri directe repetate autoritate→furnizor) — indicatori de risc recunoscuți internațional.</w:t>
+      </w:r>
+    </w:p>
+    <w:p>
+      <w:pPr>
+        <w:pStyle w:val="ListBullet"/>
+        <w:spacing w:after="40"/>
+      </w:pPr>
+      <w:r>
+        <w:rPr>
+          <w:b/>
+          <w:sz w:val="20"/>
+        </w:rPr>
+        <w:t xml:space="preserve">💰 Anomalii de avere (machine learning) — </w:t>
+      </w:r>
+      <w:r>
+        <w:rPr>
+          <w:color w:val="1C1E26"/>
+          <w:sz w:val="20"/>
+        </w:rPr>
+        <w:t xml:space="preserve">scor de anomalie (PyOD/ECOD) pe </w:t>
+      </w:r>
+      <w:r>
+        <w:rPr>
+          <w:b/>
+          <w:color w:val="1C1E26"/>
+          <w:sz w:val="20"/>
+        </w:rPr>
+        <w:t>76.838 declarații</w:t>
+      </w:r>
+      <w:r>
+        <w:rPr>
+          <w:color w:val="1C1E26"/>
+          <w:sz w:val="20"/>
+        </w:rPr>
+        <w:t xml:space="preserve"> — profiluri de avere statistic neobișnuite (venituri vs conturi/terenuri/clădiri), ca lead-uri de verificat (nu dovezi).</w:t>
+      </w:r>
+    </w:p>
+    <w:p>
+      <w:pPr>
+        <w:spacing w:before="140" w:after="60"/>
+      </w:pPr>
+      <w:r>
+        <w:rPr>
+          <w:b/>
+          <w:color w:val="6D28D9"/>
+          <w:sz w:val="25"/>
+        </w:rPr>
         <w:t>Linkuri</w:t>
       </w:r>
     </w:p>

</xml_diff>